<commit_message>
docs: regenerate the manual for round 5
The walkthrough now follows the training package's own order: the KFT
records its final decision before sign-off, v1.0 is locked, the price change
is made as a revision and locked as v1.1 together with brief v2, and Versi
compares v1.0 with v1.1. Chapters 1 and 7-10, Lampiran B and C, and the brief
contents are rewritten to match, with a screenshot of the Admin IT metadata
view. The manual is renamed Buku_Panduan_DeciBridge.{docx,pdf}.
</commit_message>
<xml_diff>
--- a/docs/panduan/contoh-brief/DB_DEMO_HF_001_policy_brief_v1.docx
+++ b/docs/panduan/contoh-brief/DB_DEMO_HF_001_policy_brief_v1.docx
@@ -173,6 +173,81 @@
               <w:rPr>
                 <w:b/>
               </w:rPr>
+              <w:t>Populasi target</w:t>
+            </w:r>
+          </w:p>
+        </w:tc>
+        <w:tc>
+          <w:tcPr>
+            <w:tcW w:type="dxa" w:w="4536"/>
+          </w:tcPr>
+          <w:p>
+            <w:r>
+              <w:t>Dewasa ≥18 tahun, HFrEF LVEF ≤40%, NYHA II–IV, stabil</w:t>
+            </w:r>
+          </w:p>
+        </w:tc>
+      </w:tr>
+      <w:tr>
+        <w:tc>
+          <w:tcPr>
+            <w:tcW w:type="dxa" w:w="4536"/>
+          </w:tcPr>
+          <w:p>
+            <w:r>
+              <w:rPr>
+                <w:b/>
+              </w:rPr>
+              <w:t>Setting</w:t>
+            </w:r>
+          </w:p>
+        </w:tc>
+        <w:tc>
+          <w:tcPr>
+            <w:tcW w:type="dxa" w:w="4536"/>
+          </w:tcPr>
+          <w:p>
+            <w:r>
+              <w:t>Formularium rumah sakit; rawat jalan HFrEF</w:t>
+            </w:r>
+          </w:p>
+        </w:tc>
+      </w:tr>
+      <w:tr>
+        <w:tc>
+          <w:tcPr>
+            <w:tcW w:type="dxa" w:w="4536"/>
+          </w:tcPr>
+          <w:p>
+            <w:r>
+              <w:rPr>
+                <w:b/>
+              </w:rPr>
+              <w:t>Perspektif</w:t>
+            </w:r>
+          </w:p>
+        </w:tc>
+        <w:tc>
+          <w:tcPr>
+            <w:tcW w:type="dxa" w:w="4536"/>
+          </w:tcPr>
+          <w:p>
+            <w:r>
+              <w:t>Rumah Sakit</w:t>
+            </w:r>
+          </w:p>
+        </w:tc>
+      </w:tr>
+      <w:tr>
+        <w:tc>
+          <w:tcPr>
+            <w:tcW w:type="dxa" w:w="4536"/>
+          </w:tcPr>
+          <w:p>
+            <w:r>
+              <w:rPr>
+                <w:b/>
+              </w:rPr>
               <w:t>Status saat ini</w:t>
             </w:r>
           </w:p>
@@ -233,7 +308,7 @@
           </w:tcPr>
           <w:p>
             <w:r>
-              <w:t>13 Oktober 2026</w:t>
+              <w:t>27 Oktober 2026</w:t>
             </w:r>
           </w:p>
         </w:tc>
@@ -254,6 +329,58 @@
           <w:color w:val="1C4E80"/>
         </w:rPr>
         <w:t>1. Ringkasan Eksekutif</w:t>
+      </w:r>
+    </w:p>
+    <w:p>
+      <w:pPr>
+        <w:pStyle w:val="Heading2"/>
+      </w:pPr>
+      <w:r>
+        <w:rPr>
+          <w:color w:val="1C4E80"/>
+        </w:rPr>
+        <w:t>Keputusan Final KFT</w:t>
+      </w:r>
+    </w:p>
+    <w:p>
+      <w:r>
+        <w:rPr>
+          <w:b/>
+          <w:sz w:val="28"/>
+        </w:rPr>
+        <w:t>Adopsi dengan kriteria akses (Adopt with criteria-based access)</w:t>
+      </w:r>
+    </w:p>
+    <w:p>
+      <w:r>
+        <w:rPr>
+          <w:b/>
+        </w:rPr>
+        <w:t xml:space="preserve">Alasan: </w:t>
+      </w:r>
+      <w:r>
+        <w:t>Manfaat klinis dan cost-effectiveness deterministik mendukung, tetapi hasil PSA tidak pasti dan dampak anggaran meningkat. Adopsi dibatasi pada pasien yang memenuhi kriteria akses.</w:t>
+      </w:r>
+    </w:p>
+    <w:p>
+      <w:r>
+        <w:t>Dicatat oleh dr. Indah Permata, Sp.JP, 27 Oktober 2026, 17:20 WIB.</w:t>
+      </w:r>
+    </w:p>
+    <w:p>
+      <w:pPr>
+        <w:pStyle w:val="Heading2"/>
+      </w:pPr>
+      <w:r>
+        <w:rPr>
+          <w:color w:val="1C4E80"/>
+        </w:rPr>
+        <w:t>Rekomendasi Sistem</w:t>
+      </w:r>
+    </w:p>
+    <w:p>
+      <w:r>
+        <w:t>Warna dan skor berikut dihitung otomatis oleh sistem sebagai bahan pertimbangan. Keputusan di atas adalah keputusan KFT.</w:t>
       </w:r>
     </w:p>
     <w:tbl>
@@ -477,7 +604,7 @@
           </w:tcPr>
           <w:p>
             <w:r>
-              <w:t>13 Oktober 2026, 20:44 WIB</w:t>
+              <w:t>27 Oktober 2026, 17:20 WIB</w:t>
             </w:r>
           </w:p>
         </w:tc>
@@ -505,7 +632,170 @@
         <w:rPr>
           <w:color w:val="1C4E80"/>
         </w:rPr>
-        <w:t>2. Analisis Efektivitas Biaya (CEA)</w:t>
+        <w:t>2. Pertanyaan Keputusan dan Populasi Target</w:t>
+      </w:r>
+    </w:p>
+    <w:p>
+      <w:r>
+        <w:rPr>
+          <w:b/>
+        </w:rPr>
+        <w:t xml:space="preserve">Populasi target: </w:t>
+      </w:r>
+      <w:r>
+        <w:t>Dewasa ≥18 tahun, HFrEF LVEF ≤40%, NYHA II–IV, stabil</w:t>
+      </w:r>
+    </w:p>
+    <w:p>
+      <w:r>
+        <w:rPr>
+          <w:b/>
+        </w:rPr>
+        <w:t xml:space="preserve">Q1: </w:t>
+      </w:r>
+      <w:r>
+        <w:t>Apakah ARNI diadopsi dibanding ramipril untuk pasien HFrEF eligible?</w:t>
+      </w:r>
+    </w:p>
+    <w:tbl>
+      <w:tblPr>
+        <w:tblStyle w:val="LightGrid-Accent1"/>
+        <w:tblW w:type="auto" w:w="0"/>
+        <w:tblLook w:firstColumn="1" w:firstRow="1" w:lastColumn="0" w:lastRow="0" w:noHBand="0" w:noVBand="1" w:val="04A0"/>
+      </w:tblPr>
+      <w:tblGrid>
+        <w:gridCol w:w="4536"/>
+        <w:gridCol w:w="4536"/>
+      </w:tblGrid>
+      <w:tr>
+        <w:tc>
+          <w:tcPr>
+            <w:tcW w:type="dxa" w:w="4536"/>
+            <w:vAlign w:val="center"/>
+          </w:tcPr>
+          <w:p>
+            <w:r>
+              <w:rPr>
+                <w:b/>
+              </w:rPr>
+              <w:t>Unsur PICO</w:t>
+            </w:r>
+          </w:p>
+        </w:tc>
+        <w:tc>
+          <w:tcPr>
+            <w:tcW w:type="dxa" w:w="4536"/>
+            <w:vAlign w:val="center"/>
+          </w:tcPr>
+          <w:p>
+            <w:r>
+              <w:rPr>
+                <w:b/>
+              </w:rPr>
+              <w:t>Isi</w:t>
+            </w:r>
+          </w:p>
+        </w:tc>
+      </w:tr>
+      <w:tr>
+        <w:tc>
+          <w:tcPr>
+            <w:tcW w:type="dxa" w:w="4536"/>
+          </w:tcPr>
+          <w:p>
+            <w:r>
+              <w:t>Populasi (P)</w:t>
+            </w:r>
+          </w:p>
+        </w:tc>
+        <w:tc>
+          <w:tcPr>
+            <w:tcW w:type="dxa" w:w="4536"/>
+          </w:tcPr>
+          <w:p>
+            <w:r>
+              <w:t>Dewasa ≥18 tahun, HFrEF LVEF ≤40%, NYHA II–IV, stabil</w:t>
+            </w:r>
+          </w:p>
+        </w:tc>
+      </w:tr>
+      <w:tr>
+        <w:tc>
+          <w:tcPr>
+            <w:tcW w:type="dxa" w:w="4536"/>
+          </w:tcPr>
+          <w:p>
+            <w:r>
+              <w:t>Intervensi (I)</w:t>
+            </w:r>
+          </w:p>
+        </w:tc>
+        <w:tc>
+          <w:tcPr>
+            <w:tcW w:type="dxa" w:w="4536"/>
+          </w:tcPr>
+          <w:p>
+            <w:r>
+              <w:t>Sacubitril/valsartan (ARNI)</w:t>
+            </w:r>
+          </w:p>
+        </w:tc>
+      </w:tr>
+      <w:tr>
+        <w:tc>
+          <w:tcPr>
+            <w:tcW w:type="dxa" w:w="4536"/>
+          </w:tcPr>
+          <w:p>
+            <w:r>
+              <w:t>Komparator (C)</w:t>
+            </w:r>
+          </w:p>
+        </w:tc>
+        <w:tc>
+          <w:tcPr>
+            <w:tcW w:type="dxa" w:w="4536"/>
+          </w:tcPr>
+          <w:p>
+            <w:r>
+              <w:t>Ramipril (ACEI)</w:t>
+            </w:r>
+          </w:p>
+        </w:tc>
+      </w:tr>
+      <w:tr>
+        <w:tc>
+          <w:tcPr>
+            <w:tcW w:type="dxa" w:w="4536"/>
+          </w:tcPr>
+          <w:p>
+            <w:r>
+              <w:t>Outcome (O)</w:t>
+            </w:r>
+          </w:p>
+        </w:tc>
+        <w:tc>
+          <w:tcPr>
+            <w:tcW w:type="dxa" w:w="4536"/>
+          </w:tcPr>
+          <w:p>
+            <w:r>
+              <w:t>QALY; rehospitalisasi HF</w:t>
+            </w:r>
+          </w:p>
+        </w:tc>
+      </w:tr>
+    </w:tbl>
+    <w:p/>
+    <w:p>
+      <w:pPr>
+        <w:pStyle w:val="Heading1"/>
+      </w:pPr>
+      <w:r>
+        <w:rPr>
+          <w:color w:val="1C4E80"/>
+        </w:rPr>
+        <w:t>3. Analisis Efektivitas Biaya (CEA)</w:t>
       </w:r>
     </w:p>
     <w:tbl>
@@ -733,7 +1023,7 @@
         <w:rPr>
           <w:color w:val="1C4E80"/>
         </w:rPr>
-        <w:t>3. Analisis Dampak Anggaran (BIA)</w:t>
+        <w:t>4. Analisis Dampak Anggaran (BIA)</w:t>
       </w:r>
     </w:p>
     <w:tbl>
@@ -995,7 +1285,423 @@
         <w:rPr>
           <w:color w:val="1C4E80"/>
         </w:rPr>
-        <w:t>4. Evidence-to-Decision (EtD) — 9 Domain GRADE</w:t>
+        <w:t>5. Analisis Sensitivitas Probabilistik (PSA)</w:t>
+      </w:r>
+    </w:p>
+    <w:tbl>
+      <w:tblPr>
+        <w:tblStyle w:val="LightGrid-Accent1"/>
+        <w:tblW w:type="auto" w:w="0"/>
+        <w:tblLook w:firstColumn="1" w:firstRow="1" w:lastColumn="0" w:lastRow="0" w:noHBand="0" w:noVBand="1" w:val="04A0"/>
+      </w:tblPr>
+      <w:tblGrid>
+        <w:gridCol w:w="4536"/>
+        <w:gridCol w:w="4536"/>
+      </w:tblGrid>
+      <w:tr>
+        <w:tc>
+          <w:tcPr>
+            <w:tcW w:type="dxa" w:w="4536"/>
+            <w:vAlign w:val="center"/>
+          </w:tcPr>
+          <w:p>
+            <w:r>
+              <w:rPr>
+                <w:b/>
+              </w:rPr>
+              <w:t>Komponen</w:t>
+            </w:r>
+          </w:p>
+        </w:tc>
+        <w:tc>
+          <w:tcPr>
+            <w:tcW w:type="dxa" w:w="4536"/>
+            <w:vAlign w:val="center"/>
+          </w:tcPr>
+          <w:p>
+            <w:r>
+              <w:rPr>
+                <w:b/>
+              </w:rPr>
+              <w:t>Nilai</w:t>
+            </w:r>
+          </w:p>
+        </w:tc>
+      </w:tr>
+      <w:tr>
+        <w:tc>
+          <w:tcPr>
+            <w:tcW w:type="dxa" w:w="4536"/>
+          </w:tcPr>
+          <w:p>
+            <w:r>
+              <w:t>Jumlah iterasi</w:t>
+            </w:r>
+          </w:p>
+        </w:tc>
+        <w:tc>
+          <w:tcPr>
+            <w:tcW w:type="dxa" w:w="4536"/>
+          </w:tcPr>
+          <w:p>
+            <w:r>
+              <w:t>5.000</w:t>
+            </w:r>
+          </w:p>
+        </w:tc>
+      </w:tr>
+      <w:tr>
+        <w:tc>
+          <w:tcPr>
+            <w:tcW w:type="dxa" w:w="4536"/>
+          </w:tcPr>
+          <w:p>
+            <w:r>
+              <w:t>Seed acak</w:t>
+            </w:r>
+          </w:p>
+        </w:tc>
+        <w:tc>
+          <w:tcPr>
+            <w:tcW w:type="dxa" w:w="4536"/>
+          </w:tcPr>
+          <w:p>
+            <w:r>
+              <w:t>42</w:t>
+            </w:r>
+          </w:p>
+        </w:tc>
+      </w:tr>
+      <w:tr>
+        <w:tc>
+          <w:tcPr>
+            <w:tcW w:type="dxa" w:w="4536"/>
+          </w:tcPr>
+          <w:p>
+            <w:r>
+              <w:t>WTP dasar</w:t>
+            </w:r>
+          </w:p>
+        </w:tc>
+        <w:tc>
+          <w:tcPr>
+            <w:tcW w:type="dxa" w:w="4536"/>
+          </w:tcPr>
+          <w:p>
+            <w:r>
+              <w:t>Rp 300.000.000 / QALY</w:t>
+            </w:r>
+          </w:p>
+        </w:tc>
+      </w:tr>
+      <w:tr>
+        <w:tc>
+          <w:tcPr>
+            <w:tcW w:type="dxa" w:w="4536"/>
+          </w:tcPr>
+          <w:p>
+            <w:r>
+              <w:t>Peluang cost-effective pada WTP dasar</w:t>
+            </w:r>
+          </w:p>
+        </w:tc>
+        <w:tc>
+          <w:tcPr>
+            <w:tcW w:type="dxa" w:w="4536"/>
+          </w:tcPr>
+          <w:p>
+            <w:r>
+              <w:t>56.0%</w:t>
+            </w:r>
+          </w:p>
+        </w:tc>
+      </w:tr>
+      <w:tr>
+        <w:tc>
+          <w:tcPr>
+            <w:tcW w:type="dxa" w:w="4536"/>
+          </w:tcPr>
+          <w:p>
+            <w:r>
+              <w:t>Rerata selisih biaya</w:t>
+            </w:r>
+          </w:p>
+        </w:tc>
+        <w:tc>
+          <w:tcPr>
+            <w:tcW w:type="dxa" w:w="4536"/>
+          </w:tcPr>
+          <w:p>
+            <w:r>
+              <w:t>Rp 12.414.195</w:t>
+            </w:r>
+          </w:p>
+        </w:tc>
+      </w:tr>
+      <w:tr>
+        <w:tc>
+          <w:tcPr>
+            <w:tcW w:type="dxa" w:w="4536"/>
+          </w:tcPr>
+          <w:p>
+            <w:r>
+              <w:t>Rerata selisih QALY</w:t>
+            </w:r>
+          </w:p>
+        </w:tc>
+        <w:tc>
+          <w:tcPr>
+            <w:tcW w:type="dxa" w:w="4536"/>
+          </w:tcPr>
+          <w:p>
+            <w:r>
+              <w:t>0.0540</w:t>
+            </w:r>
+          </w:p>
+        </w:tc>
+      </w:tr>
+      <w:tr>
+        <w:tc>
+          <w:tcPr>
+            <w:tcW w:type="dxa" w:w="4536"/>
+          </w:tcPr>
+          <w:p>
+            <w:r>
+              <w:t>Selisih biaya base case</w:t>
+            </w:r>
+          </w:p>
+        </w:tc>
+        <w:tc>
+          <w:tcPr>
+            <w:tcW w:type="dxa" w:w="4536"/>
+          </w:tcPr>
+          <w:p>
+            <w:r>
+              <w:t>Rp 12.400.000</w:t>
+            </w:r>
+          </w:p>
+        </w:tc>
+      </w:tr>
+      <w:tr>
+        <w:tc>
+          <w:tcPr>
+            <w:tcW w:type="dxa" w:w="4536"/>
+          </w:tcPr>
+          <w:p>
+            <w:r>
+              <w:t>Selisih QALY base case</w:t>
+            </w:r>
+          </w:p>
+        </w:tc>
+        <w:tc>
+          <w:tcPr>
+            <w:tcW w:type="dxa" w:w="4536"/>
+          </w:tcPr>
+          <w:p>
+            <w:r>
+              <w:t>0.0550</w:t>
+            </w:r>
+          </w:p>
+        </w:tc>
+      </w:tr>
+      <w:tr>
+        <w:tc>
+          <w:tcPr>
+            <w:tcW w:type="dxa" w:w="4536"/>
+          </w:tcPr>
+          <w:p>
+            <w:r>
+              <w:t>Waktu komputasi</w:t>
+            </w:r>
+          </w:p>
+        </w:tc>
+        <w:tc>
+          <w:tcPr>
+            <w:tcW w:type="dxa" w:w="4536"/>
+          </w:tcPr>
+          <w:p>
+            <w:r>
+              <w:t>27 Oktober 2026, 17:19 WIB</w:t>
+            </w:r>
+          </w:p>
+        </w:tc>
+      </w:tr>
+    </w:tbl>
+    <w:p/>
+    <w:p>
+      <w:r>
+        <w:rPr>
+          <w:b/>
+        </w:rPr>
+        <w:t>Kurva penerimaan biaya-efektivitas (CEAC):</w:t>
+      </w:r>
+    </w:p>
+    <w:tbl>
+      <w:tblPr>
+        <w:tblStyle w:val="LightGrid-Accent1"/>
+        <w:tblW w:type="auto" w:w="0"/>
+        <w:tblLook w:firstColumn="1" w:firstRow="1" w:lastColumn="0" w:lastRow="0" w:noHBand="0" w:noVBand="1" w:val="04A0"/>
+      </w:tblPr>
+      <w:tblGrid>
+        <w:gridCol w:w="4536"/>
+        <w:gridCol w:w="4536"/>
+      </w:tblGrid>
+      <w:tr>
+        <w:tc>
+          <w:tcPr>
+            <w:tcW w:type="dxa" w:w="4536"/>
+            <w:vAlign w:val="center"/>
+          </w:tcPr>
+          <w:p>
+            <w:r>
+              <w:rPr>
+                <w:b/>
+              </w:rPr>
+              <w:t>WTP per QALY</w:t>
+            </w:r>
+          </w:p>
+        </w:tc>
+        <w:tc>
+          <w:tcPr>
+            <w:tcW w:type="dxa" w:w="4536"/>
+            <w:vAlign w:val="center"/>
+          </w:tcPr>
+          <w:p>
+            <w:r>
+              <w:rPr>
+                <w:b/>
+              </w:rPr>
+              <w:t>Peluang cost-effective</w:t>
+            </w:r>
+          </w:p>
+        </w:tc>
+      </w:tr>
+      <w:tr>
+        <w:tc>
+          <w:tcPr>
+            <w:tcW w:type="dxa" w:w="4536"/>
+          </w:tcPr>
+          <w:p>
+            <w:r>
+              <w:t>Rp 0</w:t>
+            </w:r>
+          </w:p>
+        </w:tc>
+        <w:tc>
+          <w:tcPr>
+            <w:tcW w:type="dxa" w:w="4536"/>
+          </w:tcPr>
+          <w:p>
+            <w:r>
+              <w:t>0.0%</w:t>
+            </w:r>
+          </w:p>
+        </w:tc>
+      </w:tr>
+      <w:tr>
+        <w:tc>
+          <w:tcPr>
+            <w:tcW w:type="dxa" w:w="4536"/>
+          </w:tcPr>
+          <w:p>
+            <w:r>
+              <w:t>Rp 150.000.000</w:t>
+            </w:r>
+          </w:p>
+        </w:tc>
+        <w:tc>
+          <w:tcPr>
+            <w:tcW w:type="dxa" w:w="4536"/>
+          </w:tcPr>
+          <w:p>
+            <w:r>
+              <w:t>37.4%</w:t>
+            </w:r>
+          </w:p>
+        </w:tc>
+      </w:tr>
+      <w:tr>
+        <w:tc>
+          <w:tcPr>
+            <w:tcW w:type="dxa" w:w="4536"/>
+          </w:tcPr>
+          <w:p>
+            <w:r>
+              <w:t>Rp 300.000.000</w:t>
+            </w:r>
+          </w:p>
+        </w:tc>
+        <w:tc>
+          <w:tcPr>
+            <w:tcW w:type="dxa" w:w="4536"/>
+          </w:tcPr>
+          <w:p>
+            <w:r>
+              <w:t>56.0%</w:t>
+            </w:r>
+          </w:p>
+        </w:tc>
+      </w:tr>
+      <w:tr>
+        <w:tc>
+          <w:tcPr>
+            <w:tcW w:type="dxa" w:w="4536"/>
+          </w:tcPr>
+          <w:p>
+            <w:r>
+              <w:t>Rp 450.000.000</w:t>
+            </w:r>
+          </w:p>
+        </w:tc>
+        <w:tc>
+          <w:tcPr>
+            <w:tcW w:type="dxa" w:w="4536"/>
+          </w:tcPr>
+          <w:p>
+            <w:r>
+              <w:t>61.7%</w:t>
+            </w:r>
+          </w:p>
+        </w:tc>
+      </w:tr>
+      <w:tr>
+        <w:tc>
+          <w:tcPr>
+            <w:tcW w:type="dxa" w:w="4536"/>
+          </w:tcPr>
+          <w:p>
+            <w:r>
+              <w:t>Rp 600.000.000</w:t>
+            </w:r>
+          </w:p>
+        </w:tc>
+        <w:tc>
+          <w:tcPr>
+            <w:tcW w:type="dxa" w:w="4536"/>
+          </w:tcPr>
+          <w:p>
+            <w:r>
+              <w:t>64.9%</w:t>
+            </w:r>
+          </w:p>
+        </w:tc>
+      </w:tr>
+    </w:tbl>
+    <w:p/>
+    <w:p>
+      <w:r>
+        <w:t>PSA 5000 iterasi (seed 42). Probabilitas cost-effective pada WTP 300,000,000 IDR = 56.0%. Rata-rata incremental cost 12,414,195 IDR, incremental QALY 0.0540.</w:t>
+      </w:r>
+    </w:p>
+    <w:p>
+      <w:pPr>
+        <w:pStyle w:val="Heading1"/>
+      </w:pPr>
+      <w:r>
+        <w:rPr>
+          <w:color w:val="1C4E80"/>
+        </w:rPr>
+        <w:t>6. Evidence-to-Decision (EtD) — 9 Domain GRADE</w:t>
       </w:r>
     </w:p>
     <w:tbl>
@@ -1566,7 +2272,7 @@
         <w:rPr>
           <w:color w:val="1C4E80"/>
         </w:rPr>
-        <w:t>5. Kriteria Akses (CBA)</w:t>
+        <w:t>7. Kriteria Akses (CBA)</w:t>
       </w:r>
     </w:p>
     <w:tbl>
@@ -1877,7 +2583,7 @@
         <w:rPr>
           <w:color w:val="1C4E80"/>
         </w:rPr>
-        <w:t>6. Daftar Referensi</w:t>
+        <w:t>8. Daftar Referensi</w:t>
       </w:r>
     </w:p>
     <w:p>
@@ -1936,7 +2642,7 @@
         <w:rPr>
           <w:color w:val="1C4E80"/>
         </w:rPr>
-        <w:t>7. Ringkasan Audit &amp; Tanda Tangan</w:t>
+        <w:t>9. Ringkasan Audit &amp; Tanda Tangan</w:t>
       </w:r>
     </w:p>
     <w:tbl>
@@ -2031,7 +2737,7 @@
           </w:tcPr>
           <w:p>
             <w:r>
-              <w:t>13 Oktober 2026, 20:44 WIB</w:t>
+              <w:t>27 Oktober 2026, 17:20 WIB</w:t>
             </w:r>
           </w:p>
         </w:tc>
@@ -2096,7 +2802,7 @@
           <w:color w:val="6C757D"/>
           <w:sz w:val="18"/>
         </w:rPr>
-        <w:t>— Dokumen DeciBridge v1 · diterbitkan 13 Oktober 2026, 20:44 WIB —</w:t>
+        <w:t>— Dokumen DeciBridge v1 · diterbitkan 27 Oktober 2026, 17:20 WIB —</w:t>
       </w:r>
     </w:p>
     <w:sectPr>

</xml_diff>